<commit_message>
confusion matrix for NN
</commit_message>
<xml_diff>
--- a/EECS_738_machine_learning/mid_term/Mid Term.docx
+++ b/EECS_738_machine_learning/mid_term/Mid Term.docx
@@ -513,16 +513,379 @@
       </w:r>
     </w:p>
     <w:p>
-      <w:r>
-        <w:t>[architecture]</w:t>
-      </w:r>
-    </w:p>
-    <w:p>
-      <w:r>
-        <w:t>which contains [] dense layers with [] neurons and ReLU activation, dropout layers with rate of [], and an output layer with sigmoid activation since it’s a binary classification.</w:t>
-      </w:r>
-      <w:r>
-        <w:t xml:space="preserve"> A binary cross entropy loss is applied here, together with an Adadelta optimizer that smartly finds the optimal gradient with a learning rate of [].</w:t>
+      <w:pPr>
+        <w:pStyle w:val="HTMLPreformatted"/>
+        <w:shd w:val="clear" w:color="auto" w:fill="FFFFFF"/>
+        <w:wordWrap w:val="0"/>
+        <w:textAlignment w:val="baseline"/>
+        <w:rPr>
+          <w:color w:val="000000"/>
+          <w:sz w:val="21"/>
+          <w:szCs w:val="21"/>
+        </w:rPr>
+      </w:pPr>
+      <w:r>
+        <w:rPr>
+          <w:color w:val="000000"/>
+          <w:sz w:val="21"/>
+          <w:szCs w:val="21"/>
+        </w:rPr>
+        <w:t>_________________________________________________________________</w:t>
+      </w:r>
+    </w:p>
+    <w:p>
+      <w:pPr>
+        <w:pStyle w:val="HTMLPreformatted"/>
+        <w:shd w:val="clear" w:color="auto" w:fill="FFFFFF"/>
+        <w:wordWrap w:val="0"/>
+        <w:textAlignment w:val="baseline"/>
+        <w:rPr>
+          <w:color w:val="000000"/>
+          <w:sz w:val="21"/>
+          <w:szCs w:val="21"/>
+        </w:rPr>
+      </w:pPr>
+      <w:r>
+        <w:rPr>
+          <w:color w:val="000000"/>
+          <w:sz w:val="21"/>
+          <w:szCs w:val="21"/>
+        </w:rPr>
+        <w:t xml:space="preserve">Layer (type)                 Output Shape              Param #   </w:t>
+      </w:r>
+    </w:p>
+    <w:p>
+      <w:pPr>
+        <w:pStyle w:val="HTMLPreformatted"/>
+        <w:shd w:val="clear" w:color="auto" w:fill="FFFFFF"/>
+        <w:wordWrap w:val="0"/>
+        <w:textAlignment w:val="baseline"/>
+        <w:rPr>
+          <w:color w:val="000000"/>
+          <w:sz w:val="21"/>
+          <w:szCs w:val="21"/>
+        </w:rPr>
+      </w:pPr>
+      <w:r>
+        <w:rPr>
+          <w:color w:val="000000"/>
+          <w:sz w:val="21"/>
+          <w:szCs w:val="21"/>
+        </w:rPr>
+        <w:t>=================================================================</w:t>
+      </w:r>
+    </w:p>
+    <w:p>
+      <w:pPr>
+        <w:pStyle w:val="HTMLPreformatted"/>
+        <w:shd w:val="clear" w:color="auto" w:fill="FFFFFF"/>
+        <w:wordWrap w:val="0"/>
+        <w:textAlignment w:val="baseline"/>
+        <w:rPr>
+          <w:color w:val="000000"/>
+          <w:sz w:val="21"/>
+          <w:szCs w:val="21"/>
+        </w:rPr>
+      </w:pPr>
+      <w:r>
+        <w:rPr>
+          <w:color w:val="000000"/>
+          <w:sz w:val="21"/>
+          <w:szCs w:val="21"/>
+        </w:rPr>
+        <w:t xml:space="preserve">dense_20 (Dense)             (None, 400)               14000     </w:t>
+      </w:r>
+    </w:p>
+    <w:p>
+      <w:pPr>
+        <w:pStyle w:val="HTMLPreformatted"/>
+        <w:shd w:val="clear" w:color="auto" w:fill="FFFFFF"/>
+        <w:wordWrap w:val="0"/>
+        <w:textAlignment w:val="baseline"/>
+        <w:rPr>
+          <w:color w:val="000000"/>
+          <w:sz w:val="21"/>
+          <w:szCs w:val="21"/>
+        </w:rPr>
+      </w:pPr>
+      <w:r>
+        <w:rPr>
+          <w:color w:val="000000"/>
+          <w:sz w:val="21"/>
+          <w:szCs w:val="21"/>
+        </w:rPr>
+        <w:t>_________________________________________________________________</w:t>
+      </w:r>
+    </w:p>
+    <w:p>
+      <w:pPr>
+        <w:pStyle w:val="HTMLPreformatted"/>
+        <w:shd w:val="clear" w:color="auto" w:fill="FFFFFF"/>
+        <w:wordWrap w:val="0"/>
+        <w:textAlignment w:val="baseline"/>
+        <w:rPr>
+          <w:color w:val="000000"/>
+          <w:sz w:val="21"/>
+          <w:szCs w:val="21"/>
+        </w:rPr>
+      </w:pPr>
+      <w:r>
+        <w:rPr>
+          <w:color w:val="000000"/>
+          <w:sz w:val="21"/>
+          <w:szCs w:val="21"/>
+        </w:rPr>
+        <w:t xml:space="preserve">dropout_20 (Dropout)         (None, 400)               0         </w:t>
+      </w:r>
+    </w:p>
+    <w:p>
+      <w:pPr>
+        <w:pStyle w:val="HTMLPreformatted"/>
+        <w:shd w:val="clear" w:color="auto" w:fill="FFFFFF"/>
+        <w:wordWrap w:val="0"/>
+        <w:textAlignment w:val="baseline"/>
+        <w:rPr>
+          <w:color w:val="000000"/>
+          <w:sz w:val="21"/>
+          <w:szCs w:val="21"/>
+        </w:rPr>
+      </w:pPr>
+      <w:r>
+        <w:rPr>
+          <w:color w:val="000000"/>
+          <w:sz w:val="21"/>
+          <w:szCs w:val="21"/>
+        </w:rPr>
+        <w:t>_________________________________________________________________</w:t>
+      </w:r>
+    </w:p>
+    <w:p>
+      <w:pPr>
+        <w:pStyle w:val="HTMLPreformatted"/>
+        <w:shd w:val="clear" w:color="auto" w:fill="FFFFFF"/>
+        <w:wordWrap w:val="0"/>
+        <w:textAlignment w:val="baseline"/>
+        <w:rPr>
+          <w:color w:val="000000"/>
+          <w:sz w:val="21"/>
+          <w:szCs w:val="21"/>
+        </w:rPr>
+      </w:pPr>
+      <w:r>
+        <w:rPr>
+          <w:color w:val="000000"/>
+          <w:sz w:val="21"/>
+          <w:szCs w:val="21"/>
+        </w:rPr>
+        <w:t xml:space="preserve">dense_21 (Dense)             (None, 400)               160400    </w:t>
+      </w:r>
+    </w:p>
+    <w:p>
+      <w:pPr>
+        <w:pStyle w:val="HTMLPreformatted"/>
+        <w:shd w:val="clear" w:color="auto" w:fill="FFFFFF"/>
+        <w:wordWrap w:val="0"/>
+        <w:textAlignment w:val="baseline"/>
+        <w:rPr>
+          <w:color w:val="000000"/>
+          <w:sz w:val="21"/>
+          <w:szCs w:val="21"/>
+        </w:rPr>
+      </w:pPr>
+      <w:r>
+        <w:rPr>
+          <w:color w:val="000000"/>
+          <w:sz w:val="21"/>
+          <w:szCs w:val="21"/>
+        </w:rPr>
+        <w:lastRenderedPageBreak/>
+        <w:t>_________________________________________________________________</w:t>
+      </w:r>
+    </w:p>
+    <w:p>
+      <w:pPr>
+        <w:pStyle w:val="HTMLPreformatted"/>
+        <w:shd w:val="clear" w:color="auto" w:fill="FFFFFF"/>
+        <w:wordWrap w:val="0"/>
+        <w:textAlignment w:val="baseline"/>
+        <w:rPr>
+          <w:color w:val="000000"/>
+          <w:sz w:val="21"/>
+          <w:szCs w:val="21"/>
+        </w:rPr>
+      </w:pPr>
+      <w:r>
+        <w:rPr>
+          <w:color w:val="000000"/>
+          <w:sz w:val="21"/>
+          <w:szCs w:val="21"/>
+        </w:rPr>
+        <w:t xml:space="preserve">dense_22 (Dense)             (None, 400)               160400    </w:t>
+      </w:r>
+    </w:p>
+    <w:p>
+      <w:pPr>
+        <w:pStyle w:val="HTMLPreformatted"/>
+        <w:shd w:val="clear" w:color="auto" w:fill="FFFFFF"/>
+        <w:wordWrap w:val="0"/>
+        <w:textAlignment w:val="baseline"/>
+        <w:rPr>
+          <w:color w:val="000000"/>
+          <w:sz w:val="21"/>
+          <w:szCs w:val="21"/>
+        </w:rPr>
+      </w:pPr>
+      <w:r>
+        <w:rPr>
+          <w:color w:val="000000"/>
+          <w:sz w:val="21"/>
+          <w:szCs w:val="21"/>
+        </w:rPr>
+        <w:t>_________________________________________________________________</w:t>
+      </w:r>
+    </w:p>
+    <w:p>
+      <w:pPr>
+        <w:pStyle w:val="HTMLPreformatted"/>
+        <w:shd w:val="clear" w:color="auto" w:fill="FFFFFF"/>
+        <w:wordWrap w:val="0"/>
+        <w:textAlignment w:val="baseline"/>
+        <w:rPr>
+          <w:color w:val="000000"/>
+          <w:sz w:val="21"/>
+          <w:szCs w:val="21"/>
+        </w:rPr>
+      </w:pPr>
+      <w:r>
+        <w:rPr>
+          <w:color w:val="000000"/>
+          <w:sz w:val="21"/>
+          <w:szCs w:val="21"/>
+        </w:rPr>
+        <w:t xml:space="preserve">score_output (Dense)         (None, 1)                 401       </w:t>
+      </w:r>
+    </w:p>
+    <w:p>
+      <w:pPr>
+        <w:pStyle w:val="HTMLPreformatted"/>
+        <w:shd w:val="clear" w:color="auto" w:fill="FFFFFF"/>
+        <w:wordWrap w:val="0"/>
+        <w:textAlignment w:val="baseline"/>
+        <w:rPr>
+          <w:color w:val="000000"/>
+          <w:sz w:val="21"/>
+          <w:szCs w:val="21"/>
+        </w:rPr>
+      </w:pPr>
+      <w:r>
+        <w:rPr>
+          <w:color w:val="000000"/>
+          <w:sz w:val="21"/>
+          <w:szCs w:val="21"/>
+        </w:rPr>
+        <w:t>=================================================================</w:t>
+      </w:r>
+    </w:p>
+    <w:p>
+      <w:pPr>
+        <w:pStyle w:val="HTMLPreformatted"/>
+        <w:shd w:val="clear" w:color="auto" w:fill="FFFFFF"/>
+        <w:wordWrap w:val="0"/>
+        <w:textAlignment w:val="baseline"/>
+        <w:rPr>
+          <w:color w:val="000000"/>
+          <w:sz w:val="21"/>
+          <w:szCs w:val="21"/>
+        </w:rPr>
+      </w:pPr>
+      <w:r>
+        <w:rPr>
+          <w:color w:val="000000"/>
+          <w:sz w:val="21"/>
+          <w:szCs w:val="21"/>
+        </w:rPr>
+        <w:t>Total params: 335,201</w:t>
+      </w:r>
+    </w:p>
+    <w:p>
+      <w:pPr>
+        <w:pStyle w:val="HTMLPreformatted"/>
+        <w:shd w:val="clear" w:color="auto" w:fill="FFFFFF"/>
+        <w:wordWrap w:val="0"/>
+        <w:textAlignment w:val="baseline"/>
+        <w:rPr>
+          <w:color w:val="000000"/>
+          <w:sz w:val="21"/>
+          <w:szCs w:val="21"/>
+        </w:rPr>
+      </w:pPr>
+      <w:r>
+        <w:rPr>
+          <w:color w:val="000000"/>
+          <w:sz w:val="21"/>
+          <w:szCs w:val="21"/>
+        </w:rPr>
+        <w:t>Trainable params: 335,201</w:t>
+      </w:r>
+    </w:p>
+    <w:p>
+      <w:pPr>
+        <w:pStyle w:val="HTMLPreformatted"/>
+        <w:shd w:val="clear" w:color="auto" w:fill="FFFFFF"/>
+        <w:wordWrap w:val="0"/>
+        <w:textAlignment w:val="baseline"/>
+        <w:rPr>
+          <w:color w:val="000000"/>
+          <w:sz w:val="21"/>
+          <w:szCs w:val="21"/>
+        </w:rPr>
+      </w:pPr>
+      <w:r>
+        <w:rPr>
+          <w:color w:val="000000"/>
+          <w:sz w:val="21"/>
+          <w:szCs w:val="21"/>
+        </w:rPr>
+        <w:t>Non-trainable params: 0</w:t>
+      </w:r>
+    </w:p>
+    <w:p/>
+    <w:p>
+      <w:r>
+        <w:t xml:space="preserve">which contains </w:t>
+      </w:r>
+      <w:r>
+        <w:t>3</w:t>
+      </w:r>
+      <w:r>
+        <w:t xml:space="preserve"> dense layers with </w:t>
+      </w:r>
+      <w:r>
+        <w:t>400</w:t>
+      </w:r>
+      <w:r>
+        <w:t xml:space="preserve"> neurons and ReLU activation, dropout layers with rate of </w:t>
+      </w:r>
+      <w:r>
+        <w:t>0.1</w:t>
+      </w:r>
+      <w:r>
+        <w:t>, and an output layer with sigmoid activation since it’s a binary classification.</w:t>
+      </w:r>
+      <w:r>
+        <w:t xml:space="preserve"> A binary cross entropy loss is applied here, together with a </w:t>
+      </w:r>
+      <w:r>
+        <w:t>SGD</w:t>
+      </w:r>
+      <w:r>
+        <w:t xml:space="preserve"> optimizer with a learning rate of </w:t>
+      </w:r>
+      <w:r>
+        <w:t>1e-4</w:t>
+      </w:r>
+      <w:r>
+        <w:t>.</w:t>
       </w:r>
     </w:p>
     <w:p>
@@ -532,7 +895,6 @@
     </w:p>
     <w:p>
       <w:r>
-        <w:lastRenderedPageBreak/>
         <w:t>Q3.</w:t>
       </w:r>
     </w:p>
@@ -541,7 +903,13 @@
         <w:t>The gradient boosting classifier</w:t>
       </w:r>
       <w:r>
-        <w:t xml:space="preserve"> outputs an accuracy of [] on the test set</w:t>
+        <w:t xml:space="preserve"> outputs an accuracy of </w:t>
+      </w:r>
+      <w:r>
+        <w:t>.613</w:t>
+      </w:r>
+      <w:r>
+        <w:t xml:space="preserve"> on the test set</w:t>
       </w:r>
       <w:r>
         <w:t>, and the confusion matrix is as below:</w:t>
@@ -878,23 +1246,339 @@
     <w:p/>
     <w:p>
       <w:r>
-        <w:t>The neural network in general outputs and accuracy of [] on the test set, with the confusion matrix as below:</w:t>
-      </w:r>
-    </w:p>
-    <w:p>
-      <w:r>
-        <w:t>[confusion matrix]</w:t>
-      </w:r>
-    </w:p>
-    <w:p>
-      <w:r>
-        <w:t>[sensitivity, specificity]</w:t>
-      </w:r>
-    </w:p>
-    <w:p/>
-    <w:p>
-      <w:r>
-        <w:t>[comparison, preference]</w:t>
+        <w:t xml:space="preserve">The neural network in general outputs and accuracy of </w:t>
+      </w:r>
+      <w:r>
+        <w:t>.588</w:t>
+      </w:r>
+      <w:r>
+        <w:t xml:space="preserve"> on the test set, with the confusion matrix as below:</w:t>
+      </w:r>
+    </w:p>
+    <w:tbl>
+      <w:tblPr>
+        <w:tblStyle w:val="TableGrid"/>
+        <w:tblW w:w="9010" w:type="dxa"/>
+        <w:tblBorders>
+          <w:top w:val="none" w:sz="0" w:space="0" w:color="auto"/>
+          <w:left w:val="none" w:sz="0" w:space="0" w:color="auto"/>
+          <w:bottom w:val="none" w:sz="0" w:space="0" w:color="auto"/>
+          <w:right w:val="none" w:sz="0" w:space="0" w:color="auto"/>
+          <w:insideH w:val="none" w:sz="0" w:space="0" w:color="auto"/>
+          <w:insideV w:val="none" w:sz="0" w:space="0" w:color="auto"/>
+        </w:tblBorders>
+        <w:tblLook w:val="04A0" w:firstRow="1" w:lastRow="0" w:firstColumn="1" w:lastColumn="0" w:noHBand="0" w:noVBand="1"/>
+      </w:tblPr>
+      <w:tblGrid>
+        <w:gridCol w:w="4505"/>
+        <w:gridCol w:w="4505"/>
+      </w:tblGrid>
+      <w:tr>
+        <w:tc>
+          <w:tcPr>
+            <w:tcW w:w="4505" w:type="dxa"/>
+            <w:vAlign w:val="center"/>
+          </w:tcPr>
+          <w:p>
+            <w:pPr>
+              <w:pStyle w:val="HTMLPreformatted"/>
+              <w:shd w:val="clear" w:color="auto" w:fill="FFFFFF"/>
+              <w:wordWrap w:val="0"/>
+              <w:jc w:val="center"/>
+              <w:textAlignment w:val="baseline"/>
+              <w:rPr>
+                <w:color w:val="000000"/>
+                <w:sz w:val="21"/>
+                <w:szCs w:val="21"/>
+              </w:rPr>
+            </w:pPr>
+          </w:p>
+          <w:p>
+            <w:pPr>
+              <w:pStyle w:val="HTMLPreformatted"/>
+              <w:shd w:val="clear" w:color="auto" w:fill="FFFFFF"/>
+              <w:wordWrap w:val="0"/>
+              <w:jc w:val="center"/>
+              <w:textAlignment w:val="baseline"/>
+              <w:rPr>
+                <w:color w:val="000000"/>
+                <w:sz w:val="21"/>
+                <w:szCs w:val="21"/>
+              </w:rPr>
+            </w:pPr>
+            <w:r>
+              <w:rPr>
+                <w:color w:val="000000"/>
+                <w:sz w:val="21"/>
+                <w:szCs w:val="21"/>
+              </w:rPr>
+              <w:t>[[2</w:t>
+            </w:r>
+            <w:r>
+              <w:rPr>
+                <w:color w:val="000000"/>
+                <w:sz w:val="21"/>
+                <w:szCs w:val="21"/>
+              </w:rPr>
+              <w:t>78</w:t>
+            </w:r>
+            <w:r>
+              <w:rPr>
+                <w:color w:val="000000"/>
+                <w:sz w:val="21"/>
+                <w:szCs w:val="21"/>
+              </w:rPr>
+              <w:t xml:space="preserve"> 2</w:t>
+            </w:r>
+            <w:r>
+              <w:rPr>
+                <w:color w:val="000000"/>
+                <w:sz w:val="21"/>
+                <w:szCs w:val="21"/>
+              </w:rPr>
+              <w:t>14</w:t>
+            </w:r>
+            <w:r>
+              <w:rPr>
+                <w:color w:val="000000"/>
+                <w:sz w:val="21"/>
+                <w:szCs w:val="21"/>
+              </w:rPr>
+              <w:t>]</w:t>
+            </w:r>
+          </w:p>
+          <w:p>
+            <w:pPr>
+              <w:pStyle w:val="HTMLPreformatted"/>
+              <w:shd w:val="clear" w:color="auto" w:fill="FFFFFF"/>
+              <w:wordWrap w:val="0"/>
+              <w:jc w:val="center"/>
+              <w:textAlignment w:val="baseline"/>
+              <w:rPr>
+                <w:color w:val="000000"/>
+                <w:sz w:val="21"/>
+                <w:szCs w:val="21"/>
+              </w:rPr>
+            </w:pPr>
+            <w:r>
+              <w:rPr>
+                <w:color w:val="000000"/>
+                <w:sz w:val="21"/>
+                <w:szCs w:val="21"/>
+              </w:rPr>
+              <w:t>[1</w:t>
+            </w:r>
+            <w:r>
+              <w:rPr>
+                <w:color w:val="000000"/>
+                <w:sz w:val="21"/>
+                <w:szCs w:val="21"/>
+              </w:rPr>
+              <w:t>9</w:t>
+            </w:r>
+            <w:r>
+              <w:rPr>
+                <w:color w:val="000000"/>
+                <w:sz w:val="21"/>
+                <w:szCs w:val="21"/>
+              </w:rPr>
+              <w:t>8 31</w:t>
+            </w:r>
+            <w:r>
+              <w:rPr>
+                <w:color w:val="000000"/>
+                <w:sz w:val="21"/>
+                <w:szCs w:val="21"/>
+              </w:rPr>
+              <w:t>0</w:t>
+            </w:r>
+            <w:r>
+              <w:rPr>
+                <w:color w:val="000000"/>
+                <w:sz w:val="21"/>
+                <w:szCs w:val="21"/>
+              </w:rPr>
+              <w:t>]]</w:t>
+            </w:r>
+          </w:p>
+          <w:p>
+            <w:pPr>
+              <w:jc w:val="center"/>
+            </w:pPr>
+          </w:p>
+        </w:tc>
+        <w:tc>
+          <w:tcPr>
+            <w:tcW w:w="4505" w:type="dxa"/>
+          </w:tcPr>
+          <w:p>
+            <w:pPr>
+              <w:pStyle w:val="HTMLPreformatted"/>
+              <w:shd w:val="clear" w:color="auto" w:fill="FFFFFF"/>
+              <w:wordWrap w:val="0"/>
+              <w:textAlignment w:val="baseline"/>
+              <w:rPr>
+                <w:color w:val="000000"/>
+                <w:sz w:val="21"/>
+                <w:szCs w:val="21"/>
+              </w:rPr>
+            </w:pPr>
+            <w:r>
+              <w:rPr>
+                <w:color w:val="000000"/>
+                <w:sz w:val="21"/>
+                <w:szCs w:val="21"/>
+              </w:rPr>
+              <w:t xml:space="preserve">       sensitivity  specificity</w:t>
+            </w:r>
+          </w:p>
+          <w:p>
+            <w:pPr>
+              <w:pStyle w:val="HTMLPreformatted"/>
+              <w:shd w:val="clear" w:color="auto" w:fill="FFFFFF"/>
+              <w:wordWrap w:val="0"/>
+              <w:textAlignment w:val="baseline"/>
+              <w:rPr>
+                <w:color w:val="000000"/>
+                <w:sz w:val="21"/>
+                <w:szCs w:val="21"/>
+              </w:rPr>
+            </w:pPr>
+            <w:r>
+              <w:rPr>
+                <w:color w:val="000000"/>
+                <w:sz w:val="21"/>
+                <w:szCs w:val="21"/>
+              </w:rPr>
+              <w:t xml:space="preserve">label                          </w:t>
+            </w:r>
+          </w:p>
+          <w:p>
+            <w:pPr>
+              <w:pStyle w:val="HTMLPreformatted"/>
+              <w:shd w:val="clear" w:color="auto" w:fill="FFFFFF"/>
+              <w:wordWrap w:val="0"/>
+              <w:textAlignment w:val="baseline"/>
+              <w:rPr>
+                <w:color w:val="000000"/>
+                <w:sz w:val="21"/>
+                <w:szCs w:val="21"/>
+              </w:rPr>
+            </w:pPr>
+            <w:r>
+              <w:rPr>
+                <w:color w:val="000000"/>
+                <w:sz w:val="21"/>
+                <w:szCs w:val="21"/>
+              </w:rPr>
+              <w:t>0.0       0.5</w:t>
+            </w:r>
+            <w:r>
+              <w:rPr>
+                <w:color w:val="000000"/>
+                <w:sz w:val="21"/>
+                <w:szCs w:val="21"/>
+              </w:rPr>
+              <w:t>65041</w:t>
+            </w:r>
+            <w:r>
+              <w:rPr>
+                <w:color w:val="000000"/>
+                <w:sz w:val="21"/>
+                <w:szCs w:val="21"/>
+              </w:rPr>
+              <w:t xml:space="preserve">    0.6</w:t>
+            </w:r>
+            <w:r>
+              <w:rPr>
+                <w:color w:val="000000"/>
+                <w:sz w:val="21"/>
+                <w:szCs w:val="21"/>
+              </w:rPr>
+              <w:t>10236</w:t>
+            </w:r>
+          </w:p>
+          <w:p>
+            <w:pPr>
+              <w:pStyle w:val="HTMLPreformatted"/>
+              <w:shd w:val="clear" w:color="auto" w:fill="FFFFFF"/>
+              <w:wordWrap w:val="0"/>
+              <w:textAlignment w:val="baseline"/>
+              <w:rPr>
+                <w:color w:val="000000"/>
+                <w:sz w:val="21"/>
+                <w:szCs w:val="21"/>
+              </w:rPr>
+            </w:pPr>
+            <w:r>
+              <w:rPr>
+                <w:color w:val="000000"/>
+                <w:sz w:val="21"/>
+                <w:szCs w:val="21"/>
+              </w:rPr>
+              <w:t>1.0       0.</w:t>
+            </w:r>
+            <w:r>
+              <w:rPr>
+                <w:color w:val="000000"/>
+                <w:sz w:val="21"/>
+                <w:szCs w:val="21"/>
+              </w:rPr>
+              <w:t>610236</w:t>
+            </w:r>
+            <w:r>
+              <w:rPr>
+                <w:color w:val="000000"/>
+                <w:sz w:val="21"/>
+                <w:szCs w:val="21"/>
+              </w:rPr>
+              <w:t xml:space="preserve">    0.5</w:t>
+            </w:r>
+            <w:r>
+              <w:rPr>
+                <w:color w:val="000000"/>
+                <w:sz w:val="21"/>
+                <w:szCs w:val="21"/>
+              </w:rPr>
+              <w:t>65041</w:t>
+            </w:r>
+          </w:p>
+        </w:tc>
+      </w:tr>
+    </w:tbl>
+    <w:p>
+      <w:r>
+        <w:t>Compared with decision trees</w:t>
+      </w:r>
+      <w:r>
+        <w:t xml:space="preserve">, this neural network performs </w:t>
+      </w:r>
+      <w:r>
+        <w:t>4.1%</w:t>
+      </w:r>
+      <w:r>
+        <w:t xml:space="preserve"> worse</w:t>
+      </w:r>
+      <w:r>
+        <w:t>. The sensitivity on class 0 and class 1 declined by 1.7% and 6.6% respectively.</w:t>
+      </w:r>
+      <w:r>
+        <w:t xml:space="preserve"> From the confusion matrix, it could be observed that the NN </w:t>
+      </w:r>
+      <w:r>
+        <w:t>underperforms due to</w:t>
+      </w:r>
+      <w:r>
+        <w:t xml:space="preserve"> more false negative</w:t>
+      </w:r>
+      <w:r>
+        <w:t>s</w:t>
+      </w:r>
+      <w:r>
+        <w:t xml:space="preserve"> on class 0</w:t>
+      </w:r>
+      <w:r>
+        <w:t>. More sample trainings on class 0 could further improve its performance.</w:t>
       </w:r>
     </w:p>
     <w:p/>
@@ -1142,11 +1826,307 @@
         <w:t>, and the confusion matrix changes to:</w:t>
       </w:r>
     </w:p>
-    <w:p>
-      <w:r>
-        <w:t>[confusion matrix]</w:t>
-      </w:r>
-    </w:p>
+    <w:tbl>
+      <w:tblPr>
+        <w:tblStyle w:val="TableGrid"/>
+        <w:tblW w:w="0" w:type="auto"/>
+        <w:tblBorders>
+          <w:top w:val="none" w:sz="0" w:space="0" w:color="auto"/>
+          <w:left w:val="none" w:sz="0" w:space="0" w:color="auto"/>
+          <w:bottom w:val="none" w:sz="0" w:space="0" w:color="auto"/>
+          <w:right w:val="none" w:sz="0" w:space="0" w:color="auto"/>
+          <w:insideH w:val="none" w:sz="0" w:space="0" w:color="auto"/>
+          <w:insideV w:val="none" w:sz="0" w:space="0" w:color="auto"/>
+        </w:tblBorders>
+        <w:tblLook w:val="04A0" w:firstRow="1" w:lastRow="0" w:firstColumn="1" w:lastColumn="0" w:noHBand="0" w:noVBand="1"/>
+      </w:tblPr>
+      <w:tblGrid>
+        <w:gridCol w:w="4505"/>
+        <w:gridCol w:w="4505"/>
+      </w:tblGrid>
+      <w:tr>
+        <w:tc>
+          <w:tcPr>
+            <w:tcW w:w="4505" w:type="dxa"/>
+          </w:tcPr>
+          <w:p>
+            <w:pPr>
+              <w:shd w:val="clear" w:color="auto" w:fill="FFFFFF"/>
+              <w:tabs>
+                <w:tab w:val="left" w:pos="916"/>
+                <w:tab w:val="left" w:pos="1832"/>
+                <w:tab w:val="left" w:pos="2748"/>
+                <w:tab w:val="left" w:pos="3664"/>
+                <w:tab w:val="left" w:pos="4580"/>
+                <w:tab w:val="left" w:pos="5496"/>
+                <w:tab w:val="left" w:pos="6412"/>
+                <w:tab w:val="left" w:pos="7328"/>
+                <w:tab w:val="left" w:pos="8244"/>
+                <w:tab w:val="left" w:pos="9160"/>
+                <w:tab w:val="left" w:pos="10076"/>
+                <w:tab w:val="left" w:pos="10992"/>
+                <w:tab w:val="left" w:pos="11908"/>
+                <w:tab w:val="left" w:pos="12824"/>
+                <w:tab w:val="left" w:pos="13740"/>
+                <w:tab w:val="left" w:pos="14656"/>
+              </w:tabs>
+              <w:wordWrap w:val="0"/>
+              <w:jc w:val="center"/>
+              <w:textAlignment w:val="baseline"/>
+              <w:rPr>
+                <w:rFonts w:ascii="Courier New" w:eastAsia="Times New Roman" w:hAnsi="Courier New" w:cs="Courier New"/>
+                <w:color w:val="000000"/>
+                <w:sz w:val="21"/>
+                <w:szCs w:val="21"/>
+              </w:rPr>
+            </w:pPr>
+          </w:p>
+          <w:p>
+            <w:pPr>
+              <w:shd w:val="clear" w:color="auto" w:fill="FFFFFF"/>
+              <w:tabs>
+                <w:tab w:val="left" w:pos="916"/>
+                <w:tab w:val="left" w:pos="1832"/>
+                <w:tab w:val="left" w:pos="2748"/>
+                <w:tab w:val="left" w:pos="3664"/>
+                <w:tab w:val="left" w:pos="4580"/>
+                <w:tab w:val="left" w:pos="5496"/>
+                <w:tab w:val="left" w:pos="6412"/>
+                <w:tab w:val="left" w:pos="7328"/>
+                <w:tab w:val="left" w:pos="8244"/>
+                <w:tab w:val="left" w:pos="9160"/>
+                <w:tab w:val="left" w:pos="10076"/>
+                <w:tab w:val="left" w:pos="10992"/>
+                <w:tab w:val="left" w:pos="11908"/>
+                <w:tab w:val="left" w:pos="12824"/>
+                <w:tab w:val="left" w:pos="13740"/>
+                <w:tab w:val="left" w:pos="14656"/>
+              </w:tabs>
+              <w:wordWrap w:val="0"/>
+              <w:jc w:val="center"/>
+              <w:textAlignment w:val="baseline"/>
+              <w:rPr>
+                <w:rFonts w:ascii="Courier New" w:eastAsia="Times New Roman" w:hAnsi="Courier New" w:cs="Courier New"/>
+                <w:color w:val="000000"/>
+                <w:sz w:val="21"/>
+                <w:szCs w:val="21"/>
+              </w:rPr>
+            </w:pPr>
+            <w:r>
+              <w:rPr>
+                <w:rFonts w:ascii="Courier New" w:eastAsia="Times New Roman" w:hAnsi="Courier New" w:cs="Courier New"/>
+                <w:color w:val="000000"/>
+                <w:sz w:val="21"/>
+                <w:szCs w:val="21"/>
+              </w:rPr>
+              <w:t>[[</w:t>
+            </w:r>
+            <w:r>
+              <w:rPr>
+                <w:rFonts w:ascii="Courier New" w:eastAsia="Times New Roman" w:hAnsi="Courier New" w:cs="Courier New"/>
+                <w:color w:val="000000"/>
+                <w:sz w:val="21"/>
+                <w:szCs w:val="21"/>
+              </w:rPr>
+              <w:t>437</w:t>
+            </w:r>
+            <w:r>
+              <w:rPr>
+                <w:rFonts w:ascii="Courier New" w:eastAsia="Times New Roman" w:hAnsi="Courier New" w:cs="Courier New"/>
+                <w:color w:val="000000"/>
+                <w:sz w:val="21"/>
+                <w:szCs w:val="21"/>
+              </w:rPr>
+              <w:t xml:space="preserve"> </w:t>
+            </w:r>
+            <w:r>
+              <w:rPr>
+                <w:rFonts w:ascii="Courier New" w:eastAsia="Times New Roman" w:hAnsi="Courier New" w:cs="Courier New"/>
+                <w:color w:val="000000"/>
+                <w:sz w:val="21"/>
+                <w:szCs w:val="21"/>
+              </w:rPr>
+              <w:t>78</w:t>
+            </w:r>
+            <w:r>
+              <w:rPr>
+                <w:rFonts w:ascii="Courier New" w:eastAsia="Times New Roman" w:hAnsi="Courier New" w:cs="Courier New"/>
+                <w:color w:val="000000"/>
+                <w:sz w:val="21"/>
+                <w:szCs w:val="21"/>
+              </w:rPr>
+              <w:t>]</w:t>
+            </w:r>
+          </w:p>
+          <w:p>
+            <w:pPr>
+              <w:shd w:val="clear" w:color="auto" w:fill="FFFFFF"/>
+              <w:tabs>
+                <w:tab w:val="left" w:pos="916"/>
+                <w:tab w:val="left" w:pos="1832"/>
+                <w:tab w:val="left" w:pos="2748"/>
+                <w:tab w:val="left" w:pos="3664"/>
+                <w:tab w:val="left" w:pos="4580"/>
+                <w:tab w:val="left" w:pos="5496"/>
+                <w:tab w:val="left" w:pos="6412"/>
+                <w:tab w:val="left" w:pos="7328"/>
+                <w:tab w:val="left" w:pos="8244"/>
+                <w:tab w:val="left" w:pos="9160"/>
+                <w:tab w:val="left" w:pos="10076"/>
+                <w:tab w:val="left" w:pos="10992"/>
+                <w:tab w:val="left" w:pos="11908"/>
+                <w:tab w:val="left" w:pos="12824"/>
+                <w:tab w:val="left" w:pos="13740"/>
+                <w:tab w:val="left" w:pos="14656"/>
+              </w:tabs>
+              <w:wordWrap w:val="0"/>
+              <w:jc w:val="center"/>
+              <w:textAlignment w:val="baseline"/>
+              <w:rPr>
+                <w:rFonts w:ascii="Courier New" w:eastAsia="Times New Roman" w:hAnsi="Courier New" w:cs="Courier New"/>
+                <w:color w:val="000000"/>
+                <w:sz w:val="21"/>
+                <w:szCs w:val="21"/>
+              </w:rPr>
+            </w:pPr>
+            <w:r>
+              <w:rPr>
+                <w:rFonts w:ascii="Courier New" w:eastAsia="Times New Roman" w:hAnsi="Courier New" w:cs="Courier New"/>
+                <w:color w:val="000000"/>
+                <w:sz w:val="21"/>
+                <w:szCs w:val="21"/>
+              </w:rPr>
+              <w:t>[</w:t>
+            </w:r>
+            <w:r>
+              <w:rPr>
+                <w:rFonts w:ascii="Courier New" w:eastAsia="Times New Roman" w:hAnsi="Courier New" w:cs="Courier New"/>
+                <w:color w:val="000000"/>
+                <w:sz w:val="21"/>
+                <w:szCs w:val="21"/>
+              </w:rPr>
+              <w:t>352</w:t>
+            </w:r>
+            <w:r>
+              <w:rPr>
+                <w:rFonts w:ascii="Courier New" w:eastAsia="Times New Roman" w:hAnsi="Courier New" w:cs="Courier New"/>
+                <w:color w:val="000000"/>
+                <w:sz w:val="21"/>
+                <w:szCs w:val="21"/>
+              </w:rPr>
+              <w:t xml:space="preserve"> </w:t>
+            </w:r>
+            <w:r>
+              <w:rPr>
+                <w:rFonts w:ascii="Courier New" w:eastAsia="Times New Roman" w:hAnsi="Courier New" w:cs="Courier New"/>
+                <w:color w:val="000000"/>
+                <w:sz w:val="21"/>
+                <w:szCs w:val="21"/>
+              </w:rPr>
+              <w:t>133</w:t>
+            </w:r>
+            <w:r>
+              <w:rPr>
+                <w:rFonts w:ascii="Courier New" w:eastAsia="Times New Roman" w:hAnsi="Courier New" w:cs="Courier New"/>
+                <w:color w:val="000000"/>
+                <w:sz w:val="21"/>
+                <w:szCs w:val="21"/>
+              </w:rPr>
+              <w:t>]]</w:t>
+            </w:r>
+          </w:p>
+        </w:tc>
+        <w:tc>
+          <w:tcPr>
+            <w:tcW w:w="4505" w:type="dxa"/>
+          </w:tcPr>
+          <w:p>
+            <w:pPr>
+              <w:pStyle w:val="HTMLPreformatted"/>
+              <w:shd w:val="clear" w:color="auto" w:fill="FFFFFF"/>
+              <w:wordWrap w:val="0"/>
+              <w:textAlignment w:val="baseline"/>
+              <w:rPr>
+                <w:color w:val="000000"/>
+                <w:sz w:val="21"/>
+                <w:szCs w:val="21"/>
+              </w:rPr>
+            </w:pPr>
+            <w:r>
+              <w:rPr>
+                <w:color w:val="000000"/>
+                <w:sz w:val="21"/>
+                <w:szCs w:val="21"/>
+              </w:rPr>
+              <w:t xml:space="preserve">       sensitivity  specificity</w:t>
+            </w:r>
+          </w:p>
+          <w:p>
+            <w:pPr>
+              <w:pStyle w:val="HTMLPreformatted"/>
+              <w:shd w:val="clear" w:color="auto" w:fill="FFFFFF"/>
+              <w:wordWrap w:val="0"/>
+              <w:textAlignment w:val="baseline"/>
+              <w:rPr>
+                <w:color w:val="000000"/>
+                <w:sz w:val="21"/>
+                <w:szCs w:val="21"/>
+              </w:rPr>
+            </w:pPr>
+            <w:r>
+              <w:rPr>
+                <w:color w:val="000000"/>
+                <w:sz w:val="21"/>
+                <w:szCs w:val="21"/>
+              </w:rPr>
+              <w:t xml:space="preserve">label                          </w:t>
+            </w:r>
+          </w:p>
+          <w:p>
+            <w:pPr>
+              <w:pStyle w:val="HTMLPreformatted"/>
+              <w:shd w:val="clear" w:color="auto" w:fill="FFFFFF"/>
+              <w:wordWrap w:val="0"/>
+              <w:textAlignment w:val="baseline"/>
+              <w:rPr>
+                <w:color w:val="000000"/>
+                <w:sz w:val="21"/>
+                <w:szCs w:val="21"/>
+              </w:rPr>
+            </w:pPr>
+            <w:r>
+              <w:rPr>
+                <w:color w:val="000000"/>
+                <w:sz w:val="21"/>
+                <w:szCs w:val="21"/>
+              </w:rPr>
+              <w:t>0.0       0.574757    0.653608</w:t>
+            </w:r>
+          </w:p>
+          <w:p>
+            <w:pPr>
+              <w:pStyle w:val="HTMLPreformatted"/>
+              <w:shd w:val="clear" w:color="auto" w:fill="FFFFFF"/>
+              <w:wordWrap w:val="0"/>
+              <w:textAlignment w:val="baseline"/>
+              <w:rPr>
+                <w:color w:val="000000"/>
+                <w:sz w:val="21"/>
+                <w:szCs w:val="21"/>
+              </w:rPr>
+            </w:pPr>
+            <w:r>
+              <w:rPr>
+                <w:color w:val="000000"/>
+                <w:sz w:val="21"/>
+                <w:szCs w:val="21"/>
+              </w:rPr>
+              <w:t>1.0       0.653608    0.574757</w:t>
+            </w:r>
+          </w:p>
+        </w:tc>
+      </w:tr>
+    </w:tbl>
     <w:p/>
     <w:sectPr>
       <w:pgSz w:w="11900" w:h="16840"/>

</xml_diff>